<commit_message>
CS1103 Unit 6: add generic mapItems method (16/16 tests), cite Bro Code and Coding with John accurately
Co-Authored-By: Claude Opus 5.5 <noreply@anthropic.com>
</commit_message>
<xml_diff>
--- a/CS1103_Programming_2/Unit6_Generic_Programming/Assignment/Unit6_Programming_Assignment.docx
+++ b/CS1103_Programming_2/Unit6_Generic_Programming/Assignment/Unit6_Programming_Assignment.docx
@@ -453,7 +453,7 @@
                 <w:b w:val="0"/>
                 <w:sz w:val="21"/>
               </w:rPr>
-              <w:t>Stores items and provides add, remove, retrieve, list, and search operations</w:t>
+              <w:t>Stores items and provides add, remove, retrieve, list, search, and map operations</w:t>
             </w:r>
           </w:p>
         </w:tc>
@@ -677,7 +677,7 @@
                 <w:b w:val="0"/>
                 <w:sz w:val="21"/>
               </w:rPr>
-              <w:t>15 automated checks of the catalog and items</w:t>
+              <w:t>16 automated checks of the catalog and items</w:t>
             </w:r>
           </w:p>
         </w:tc>
@@ -763,6 +763,19 @@
           <w:rFonts w:ascii="Courier New" w:hAnsi="Courier New"/>
           <w:sz w:val="19"/>
         </w:rPr>
+        <w:t xml:space="preserve">                  |  &lt;R&gt; mapItems(Function&lt;..., R&gt;)      |</w:t>
+      </w:r>
+    </w:p>
+    <w:p>
+      <w:pPr>
+        <w:spacing w:line="240" w:lineRule="auto" w:after="0"/>
+        <w:ind w:left="432"/>
+      </w:pPr>
+      <w:r>
+        <w:rPr>
+          <w:rFonts w:ascii="Courier New" w:hAnsi="Courier New"/>
+          <w:sz w:val="19"/>
+        </w:rPr>
         <w:t xml:space="preserve">                  |  &lt;E&gt; printItems(label, List&lt;E&gt;)      |</w:t>
       </w:r>
     </w:p>
@@ -999,7 +1012,7 @@
           <w:i w:val="0"/>
           <w:sz w:val="24"/>
         </w:rPr>
-        <w:t xml:space="preserve"> findItems takes a Predicate&lt;? super T&gt;, so a search condition written for the general type LibraryItem&lt;?&gt; can be reused on a catalog of books. A lower-bounded wildcard, written with super, accepts the named type or any of its supertypes, which is exactly what a reusable condition needs (Kumar, 2023).</w:t>
+        <w:t xml:space="preserve"> findItems takes a Predicate&lt;? super T&gt;, so a search condition written for the general type LibraryItem&lt;?&gt; can be reused on a catalog of books. A lower-bounded wildcard, written with super, accepts the named type or any of its supertypes, which is exactly what a reusable condition needs (Coding with John, 2021; Kumar, 2023).</w:t>
       </w:r>
     </w:p>
     <w:p>
@@ -1023,7 +1036,7 @@
           <w:i w:val="0"/>
           <w:sz w:val="24"/>
         </w:rPr>
-        <w:t>A generic method.</w:t>
+        <w:t>Generic methods.</w:t>
       </w:r>
       <w:r>
         <w:rPr>
@@ -1032,7 +1045,7 @@
           <w:i w:val="0"/>
           <w:sz w:val="24"/>
         </w:rPr>
-        <w:t xml:space="preserve"> The static method &lt;E extends LibraryItem&lt;?&gt;&gt; printItems(String, List&lt;E&gt;) prints any list of library items, so the same code displays the full catalog and the search results.</w:t>
+        <w:t xml:space="preserve"> A generic method declares its own type parameter before its return type (Bro Code, 2020; Eck, 2022). The catalog has two. The static method &lt;E extends LibraryItem&lt;?&gt;&gt; printItems(String, List&lt;E&gt;) prints any list of library items, so the same code displays the full catalog and the search results. The instance method &lt;R&gt; List&lt;R&gt; mapItems(Function&lt;? super T, ? extends R&gt;) turns every item into a value of whatever type R the caller chooses, for example a list of titles (List&lt;String&gt;).</w:t>
       </w:r>
     </w:p>
     <w:p>
@@ -1918,7 +1931,7 @@
                 <w:b w:val="0"/>
                 <w:sz w:val="21"/>
               </w:rPr>
-              <w:t>CatalogTest: 15 checks covering books, DVDs, magazines, and mixed catalogs</w:t>
+              <w:t>CatalogTest: 16 checks covering books, DVDs, magazines, and mixed catalogs</w:t>
             </w:r>
           </w:p>
         </w:tc>
@@ -2057,7 +2070,7 @@
           <w:i w:val="0"/>
           <w:sz w:val="24"/>
         </w:rPr>
-        <w:t>CatalogTest checks the catalog with every item type, a mixed catalog, and every error case. All 15 checks pass:</w:t>
+        <w:t>CatalogTest checks the catalog with every item type, a mixed catalog, both generic methods, and every error case. All 16 checks pass:</w:t>
       </w:r>
     </w:p>
     <w:p>
@@ -2265,6 +2278,19 @@
           <w:rFonts w:ascii="Courier New" w:hAnsi="Courier New"/>
           <w:sz w:val="19"/>
         </w:rPr>
+        <w:t>PASS  generic mapItems returns each item's title</w:t>
+      </w:r>
+    </w:p>
+    <w:p>
+      <w:pPr>
+        <w:spacing w:line="240" w:lineRule="auto" w:after="0"/>
+        <w:ind w:left="432"/>
+      </w:pPr>
+      <w:r>
+        <w:rPr>
+          <w:rFonts w:ascii="Courier New" w:hAnsi="Courier New"/>
+          <w:sz w:val="19"/>
+        </w:rPr>
         <w:t xml:space="preserve"> </w:t>
       </w:r>
     </w:p>
@@ -2278,7 +2304,7 @@
           <w:rFonts w:ascii="Courier New" w:hAnsi="Courier New"/>
           <w:sz w:val="19"/>
         </w:rPr>
-        <w:t>Tests passed: 15, failed: 0</w:t>
+        <w:t>Tests passed: 16, failed: 0</w:t>
       </w:r>
     </w:p>
     <w:p>
@@ -2960,7 +2986,7 @@
           <w:i/>
           <w:sz w:val="24"/>
         </w:rPr>
-        <w:t>Automated Tests: All 15 Checks Pass</w:t>
+        <w:t>Automated Tests: All 16 Checks Pass</w:t>
       </w:r>
     </w:p>
     <w:p>
@@ -5128,6 +5154,19 @@
           <w:rFonts w:ascii="Courier New" w:hAnsi="Courier New"/>
           <w:sz w:val="19"/>
         </w:rPr>
+        <w:t>import java.util.function.Function;</w:t>
+      </w:r>
+    </w:p>
+    <w:p>
+      <w:pPr>
+        <w:spacing w:line="240" w:lineRule="auto" w:after="0"/>
+        <w:ind w:left="432"/>
+      </w:pPr>
+      <w:r>
+        <w:rPr>
+          <w:rFonts w:ascii="Courier New" w:hAnsi="Courier New"/>
+          <w:sz w:val="19"/>
+        </w:rPr>
         <w:t>import java.util.function.Predicate;</w:t>
       </w:r>
     </w:p>
@@ -6221,6 +6260,227 @@
           <w:sz w:val="19"/>
         </w:rPr>
         <w:t xml:space="preserve">        return matches;</w:t>
+      </w:r>
+    </w:p>
+    <w:p>
+      <w:pPr>
+        <w:spacing w:line="240" w:lineRule="auto" w:after="0"/>
+        <w:ind w:left="432"/>
+      </w:pPr>
+      <w:r>
+        <w:rPr>
+          <w:rFonts w:ascii="Courier New" w:hAnsi="Courier New"/>
+          <w:sz w:val="19"/>
+        </w:rPr>
+        <w:t xml:space="preserve">    }</w:t>
+      </w:r>
+    </w:p>
+    <w:p>
+      <w:pPr>
+        <w:spacing w:line="240" w:lineRule="auto" w:after="0"/>
+        <w:ind w:left="432"/>
+      </w:pPr>
+      <w:r>
+        <w:rPr>
+          <w:rFonts w:ascii="Courier New" w:hAnsi="Courier New"/>
+          <w:sz w:val="19"/>
+        </w:rPr>
+        <w:t xml:space="preserve"> </w:t>
+      </w:r>
+    </w:p>
+    <w:p>
+      <w:pPr>
+        <w:spacing w:line="240" w:lineRule="auto" w:after="0"/>
+        <w:ind w:left="432"/>
+      </w:pPr>
+      <w:r>
+        <w:rPr>
+          <w:rFonts w:ascii="Courier New" w:hAnsi="Courier New"/>
+          <w:sz w:val="19"/>
+        </w:rPr>
+        <w:t xml:space="preserve">    /**</w:t>
+      </w:r>
+    </w:p>
+    <w:p>
+      <w:pPr>
+        <w:spacing w:line="240" w:lineRule="auto" w:after="0"/>
+        <w:ind w:left="432"/>
+      </w:pPr>
+      <w:r>
+        <w:rPr>
+          <w:rFonts w:ascii="Courier New" w:hAnsi="Courier New"/>
+          <w:sz w:val="19"/>
+        </w:rPr>
+        <w:t xml:space="preserve">     * Generic method that converts every item into a value of another type, for example</w:t>
+      </w:r>
+    </w:p>
+    <w:p>
+      <w:pPr>
+        <w:spacing w:line="240" w:lineRule="auto" w:after="0"/>
+        <w:ind w:left="432"/>
+      </w:pPr>
+      <w:r>
+        <w:rPr>
+          <w:rFonts w:ascii="Courier New" w:hAnsi="Courier New"/>
+          <w:sz w:val="19"/>
+        </w:rPr>
+        <w:t xml:space="preserve">     * each item's title (a String) or its ID. The method's own type parameter {@code R}</w:t>
+      </w:r>
+    </w:p>
+    <w:p>
+      <w:pPr>
+        <w:spacing w:line="240" w:lineRule="auto" w:after="0"/>
+        <w:ind w:left="432"/>
+      </w:pPr>
+      <w:r>
+        <w:rPr>
+          <w:rFonts w:ascii="Courier New" w:hAnsi="Courier New"/>
+          <w:sz w:val="19"/>
+        </w:rPr>
+        <w:t xml:space="preserve">     * is chosen by the caller, so one method serves many purposes.</w:t>
+      </w:r>
+    </w:p>
+    <w:p>
+      <w:pPr>
+        <w:spacing w:line="240" w:lineRule="auto" w:after="0"/>
+        <w:ind w:left="432"/>
+      </w:pPr>
+      <w:r>
+        <w:rPr>
+          <w:rFonts w:ascii="Courier New" w:hAnsi="Courier New"/>
+          <w:sz w:val="19"/>
+        </w:rPr>
+        <w:t xml:space="preserve">     *</w:t>
+      </w:r>
+    </w:p>
+    <w:p>
+      <w:pPr>
+        <w:spacing w:line="240" w:lineRule="auto" w:after="0"/>
+        <w:ind w:left="432"/>
+      </w:pPr>
+      <w:r>
+        <w:rPr>
+          <w:rFonts w:ascii="Courier New" w:hAnsi="Courier New"/>
+          <w:sz w:val="19"/>
+        </w:rPr>
+        <w:t xml:space="preserve">     * @param &lt;R&gt;    the type of value produced for each item</w:t>
+      </w:r>
+    </w:p>
+    <w:p>
+      <w:pPr>
+        <w:spacing w:line="240" w:lineRule="auto" w:after="0"/>
+        <w:ind w:left="432"/>
+      </w:pPr>
+      <w:r>
+        <w:rPr>
+          <w:rFonts w:ascii="Courier New" w:hAnsi="Courier New"/>
+          <w:sz w:val="19"/>
+        </w:rPr>
+        <w:t xml:space="preserve">     * @param mapper the conversion applied to each item</w:t>
+      </w:r>
+    </w:p>
+    <w:p>
+      <w:pPr>
+        <w:spacing w:line="240" w:lineRule="auto" w:after="0"/>
+        <w:ind w:left="432"/>
+      </w:pPr>
+      <w:r>
+        <w:rPr>
+          <w:rFonts w:ascii="Courier New" w:hAnsi="Courier New"/>
+          <w:sz w:val="19"/>
+        </w:rPr>
+        <w:t xml:space="preserve">     * @return the converted values, in the order the items were added</w:t>
+      </w:r>
+    </w:p>
+    <w:p>
+      <w:pPr>
+        <w:spacing w:line="240" w:lineRule="auto" w:after="0"/>
+        <w:ind w:left="432"/>
+      </w:pPr>
+      <w:r>
+        <w:rPr>
+          <w:rFonts w:ascii="Courier New" w:hAnsi="Courier New"/>
+          <w:sz w:val="19"/>
+        </w:rPr>
+        <w:t xml:space="preserve">     */</w:t>
+      </w:r>
+    </w:p>
+    <w:p>
+      <w:pPr>
+        <w:spacing w:line="240" w:lineRule="auto" w:after="0"/>
+        <w:ind w:left="432"/>
+      </w:pPr>
+      <w:r>
+        <w:rPr>
+          <w:rFonts w:ascii="Courier New" w:hAnsi="Courier New"/>
+          <w:sz w:val="19"/>
+        </w:rPr>
+        <w:t xml:space="preserve">    public &lt;R&gt; List&lt;R&gt; mapItems(Function&lt;? super T, ? extends R&gt; mapper) {</w:t>
+      </w:r>
+    </w:p>
+    <w:p>
+      <w:pPr>
+        <w:spacing w:line="240" w:lineRule="auto" w:after="0"/>
+        <w:ind w:left="432"/>
+      </w:pPr>
+      <w:r>
+        <w:rPr>
+          <w:rFonts w:ascii="Courier New" w:hAnsi="Courier New"/>
+          <w:sz w:val="19"/>
+        </w:rPr>
+        <w:t xml:space="preserve">        List&lt;R&gt; results = new ArrayList&lt;&gt;();</w:t>
+      </w:r>
+    </w:p>
+    <w:p>
+      <w:pPr>
+        <w:spacing w:line="240" w:lineRule="auto" w:after="0"/>
+        <w:ind w:left="432"/>
+      </w:pPr>
+      <w:r>
+        <w:rPr>
+          <w:rFonts w:ascii="Courier New" w:hAnsi="Courier New"/>
+          <w:sz w:val="19"/>
+        </w:rPr>
+        <w:t xml:space="preserve">        for (T item : items.values()) {</w:t>
+      </w:r>
+    </w:p>
+    <w:p>
+      <w:pPr>
+        <w:spacing w:line="240" w:lineRule="auto" w:after="0"/>
+        <w:ind w:left="432"/>
+      </w:pPr>
+      <w:r>
+        <w:rPr>
+          <w:rFonts w:ascii="Courier New" w:hAnsi="Courier New"/>
+          <w:sz w:val="19"/>
+        </w:rPr>
+        <w:t xml:space="preserve">            results.add(mapper.apply(item));</w:t>
+      </w:r>
+    </w:p>
+    <w:p>
+      <w:pPr>
+        <w:spacing w:line="240" w:lineRule="auto" w:after="0"/>
+        <w:ind w:left="432"/>
+      </w:pPr>
+      <w:r>
+        <w:rPr>
+          <w:rFonts w:ascii="Courier New" w:hAnsi="Courier New"/>
+          <w:sz w:val="19"/>
+        </w:rPr>
+        <w:t xml:space="preserve">        }</w:t>
+      </w:r>
+    </w:p>
+    <w:p>
+      <w:pPr>
+        <w:spacing w:line="240" w:lineRule="auto" w:after="0"/>
+        <w:ind w:left="432"/>
+      </w:pPr>
+      <w:r>
+        <w:rPr>
+          <w:rFonts w:ascii="Courier New" w:hAnsi="Courier New"/>
+          <w:sz w:val="19"/>
+        </w:rPr>
+        <w:t xml:space="preserve">        return results;</w:t>
       </w:r>
     </w:p>
     <w:p>
@@ -8910,6 +9170,19 @@
           <w:rFonts w:ascii="Courier New" w:hAnsi="Courier New"/>
           <w:sz w:val="19"/>
         </w:rPr>
+        <w:t xml:space="preserve">        testMapItems();</w:t>
+      </w:r>
+    </w:p>
+    <w:p>
+      <w:pPr>
+        <w:spacing w:line="240" w:lineRule="auto" w:after="0"/>
+        <w:ind w:left="432"/>
+      </w:pPr>
+      <w:r>
+        <w:rPr>
+          <w:rFonts w:ascii="Courier New" w:hAnsi="Courier New"/>
+          <w:sz w:val="19"/>
+        </w:rPr>
         <w:t xml:space="preserve">        System.out.printf("%nTests passed: %d, failed: %d%n", passed, failed);</w:t>
       </w:r>
     </w:p>
@@ -10432,6 +10705,110 @@
           <w:sz w:val="19"/>
         </w:rPr>
         <w:t xml:space="preserve">                &amp;&amp; found.get(0).getItemID().equals("B1"));</w:t>
+      </w:r>
+    </w:p>
+    <w:p>
+      <w:pPr>
+        <w:spacing w:line="240" w:lineRule="auto" w:after="0"/>
+        <w:ind w:left="432"/>
+      </w:pPr>
+      <w:r>
+        <w:rPr>
+          <w:rFonts w:ascii="Courier New" w:hAnsi="Courier New"/>
+          <w:sz w:val="19"/>
+        </w:rPr>
+        <w:t xml:space="preserve">    }</w:t>
+      </w:r>
+    </w:p>
+    <w:p>
+      <w:pPr>
+        <w:spacing w:line="240" w:lineRule="auto" w:after="0"/>
+        <w:ind w:left="432"/>
+      </w:pPr>
+      <w:r>
+        <w:rPr>
+          <w:rFonts w:ascii="Courier New" w:hAnsi="Courier New"/>
+          <w:sz w:val="19"/>
+        </w:rPr>
+        <w:t xml:space="preserve"> </w:t>
+      </w:r>
+    </w:p>
+    <w:p>
+      <w:pPr>
+        <w:spacing w:line="240" w:lineRule="auto" w:after="0"/>
+        <w:ind w:left="432"/>
+      </w:pPr>
+      <w:r>
+        <w:rPr>
+          <w:rFonts w:ascii="Courier New" w:hAnsi="Courier New"/>
+          <w:sz w:val="19"/>
+        </w:rPr>
+        <w:t xml:space="preserve">    private static void testMapItems() throws Exception {</w:t>
+      </w:r>
+    </w:p>
+    <w:p>
+      <w:pPr>
+        <w:spacing w:line="240" w:lineRule="auto" w:after="0"/>
+        <w:ind w:left="432"/>
+      </w:pPr>
+      <w:r>
+        <w:rPr>
+          <w:rFonts w:ascii="Courier New" w:hAnsi="Courier New"/>
+          <w:sz w:val="19"/>
+        </w:rPr>
+        <w:t xml:space="preserve">        Catalog&lt;LibraryItem&lt;?&gt;&gt; mixed = new Catalog&lt;&gt;();</w:t>
+      </w:r>
+    </w:p>
+    <w:p>
+      <w:pPr>
+        <w:spacing w:line="240" w:lineRule="auto" w:after="0"/>
+        <w:ind w:left="432"/>
+      </w:pPr>
+      <w:r>
+        <w:rPr>
+          <w:rFonts w:ascii="Courier New" w:hAnsi="Courier New"/>
+          <w:sz w:val="19"/>
+        </w:rPr>
+        <w:t xml:space="preserve">        mixed.addItem(book("B1"));</w:t>
+      </w:r>
+    </w:p>
+    <w:p>
+      <w:pPr>
+        <w:spacing w:line="240" w:lineRule="auto" w:after="0"/>
+        <w:ind w:left="432"/>
+      </w:pPr>
+      <w:r>
+        <w:rPr>
+          <w:rFonts w:ascii="Courier New" w:hAnsi="Courier New"/>
+          <w:sz w:val="19"/>
+        </w:rPr>
+        <w:t xml:space="preserve">        mixed.addItem(new LibraryItem&lt;&gt;("D1", "Up", "Pete Docter", new DvdDetails(96, "PG")));</w:t>
+      </w:r>
+    </w:p>
+    <w:p>
+      <w:pPr>
+        <w:spacing w:line="240" w:lineRule="auto" w:after="0"/>
+        <w:ind w:left="432"/>
+      </w:pPr>
+      <w:r>
+        <w:rPr>
+          <w:rFonts w:ascii="Courier New" w:hAnsi="Courier New"/>
+          <w:sz w:val="19"/>
+        </w:rPr>
+        <w:t xml:space="preserve">        List&lt;String&gt; titles = mixed.mapItems(LibraryItem::getTitle);</w:t>
+      </w:r>
+    </w:p>
+    <w:p>
+      <w:pPr>
+        <w:spacing w:line="240" w:lineRule="auto" w:after="0"/>
+        <w:ind w:left="432"/>
+      </w:pPr>
+      <w:r>
+        <w:rPr>
+          <w:rFonts w:ascii="Courier New" w:hAnsi="Courier New"/>
+          <w:sz w:val="19"/>
+        </w:rPr>
+        <w:t xml:space="preserve">        check("generic mapItems returns each item's title", titles.equals(List.of("Java Basics", "Up")));</w:t>
       </w:r>
     </w:p>
     <w:p>
@@ -10497,7 +10874,7 @@
           <w:i w:val="0"/>
           <w:sz w:val="24"/>
         </w:rPr>
-        <w:t xml:space="preserve">Divertitto, A. (2022, August 18). </w:t>
+        <w:t xml:space="preserve">Bro Code. (2020, July 27). </w:t>
       </w:r>
       <w:r>
         <w:rPr>
@@ -10506,7 +10883,7 @@
           <w:i/>
           <w:sz w:val="24"/>
         </w:rPr>
-        <w:t>Java generics: How to use angled brackets in practice</w:t>
+        <w:t>Java generics</w:t>
       </w:r>
       <w:r>
         <w:rPr>
@@ -10515,9 +10892,97 @@
           <w:i w:val="0"/>
           <w:sz w:val="24"/>
         </w:rPr>
+        <w:t xml:space="preserve"> [Video]. YouTube. </w:t>
+      </w:r>
+      <w:hyperlink r:id="rId10">
+        <w:r>
+          <w:rPr>
+            <w:rFonts w:ascii="Times New Roman" w:hAnsi="Times New Roman"/>
+            <w:color w:val="0563C1"/>
+            <w:u w:val="single"/>
+            <w:sz w:val="24"/>
+          </w:rPr>
+          <w:t>https://www.youtube.com/watch?v=jUcAyZ5OUm0</w:t>
+        </w:r>
+      </w:hyperlink>
+    </w:p>
+    <w:p>
+      <w:pPr>
+        <w:spacing w:line="360" w:lineRule="auto" w:after="0"/>
+        <w:ind w:left="720" w:hanging="720"/>
+      </w:pPr>
+      <w:r>
+        <w:rPr>
+          <w:rFonts w:ascii="Times New Roman" w:hAnsi="Times New Roman"/>
+          <w:b w:val="0"/>
+          <w:i w:val="0"/>
+          <w:sz w:val="24"/>
+        </w:rPr>
+        <w:t xml:space="preserve">Coding with John. (2021, December 20). </w:t>
+      </w:r>
+      <w:r>
+        <w:rPr>
+          <w:rFonts w:ascii="Times New Roman" w:hAnsi="Times New Roman"/>
+          <w:b w:val="0"/>
+          <w:i/>
+          <w:sz w:val="24"/>
+        </w:rPr>
+        <w:t>Generics in Java - Full simple tutorial</w:t>
+      </w:r>
+      <w:r>
+        <w:rPr>
+          <w:rFonts w:ascii="Times New Roman" w:hAnsi="Times New Roman"/>
+          <w:b w:val="0"/>
+          <w:i w:val="0"/>
+          <w:sz w:val="24"/>
+        </w:rPr>
+        <w:t xml:space="preserve"> [Video]. YouTube. </w:t>
+      </w:r>
+      <w:hyperlink r:id="rId11">
+        <w:r>
+          <w:rPr>
+            <w:rFonts w:ascii="Times New Roman" w:hAnsi="Times New Roman"/>
+            <w:color w:val="0563C1"/>
+            <w:u w:val="single"/>
+            <w:sz w:val="24"/>
+          </w:rPr>
+          <w:t>https://www.youtube.com/watch?v=K1iu1kXkVoA</w:t>
+        </w:r>
+      </w:hyperlink>
+    </w:p>
+    <w:p>
+      <w:pPr>
+        <w:spacing w:line="360" w:lineRule="auto" w:after="0"/>
+        <w:ind w:left="720" w:hanging="720"/>
+      </w:pPr>
+      <w:r>
+        <w:rPr>
+          <w:rFonts w:ascii="Times New Roman" w:hAnsi="Times New Roman"/>
+          <w:b w:val="0"/>
+          <w:i w:val="0"/>
+          <w:sz w:val="24"/>
+        </w:rPr>
+        <w:t xml:space="preserve">Divertitto, A. (2022, August 18). </w:t>
+      </w:r>
+      <w:r>
+        <w:rPr>
+          <w:rFonts w:ascii="Times New Roman" w:hAnsi="Times New Roman"/>
+          <w:b w:val="0"/>
+          <w:i/>
+          <w:sz w:val="24"/>
+        </w:rPr>
+        <w:t>Java generics: How to use angled brackets in practice</w:t>
+      </w:r>
+      <w:r>
+        <w:rPr>
+          <w:rFonts w:ascii="Times New Roman" w:hAnsi="Times New Roman"/>
+          <w:b w:val="0"/>
+          <w:i w:val="0"/>
+          <w:sz w:val="24"/>
+        </w:rPr>
         <w:t xml:space="preserve">. CodeGym. </w:t>
       </w:r>
-      <w:hyperlink r:id="rId10">
+      <w:hyperlink r:id="rId12">
         <w:r>
           <w:rPr>
             <w:rFonts w:ascii="Times New Roman" w:hAnsi="Times New Roman"/>
@@ -10561,7 +11026,7 @@
         </w:rPr>
         <w:t xml:space="preserve"> (Version 9, JavaFX ed.). Hobart and William Smith Colleges. </w:t>
       </w:r>
-      <w:hyperlink r:id="rId11">
+      <w:hyperlink r:id="rId13">
         <w:r>
           <w:rPr>
             <w:rFonts w:ascii="Times New Roman" w:hAnsi="Times New Roman"/>
@@ -10605,7 +11070,7 @@
         </w:rPr>
         <w:t xml:space="preserve">. Tech Thoughts Explorer. </w:t>
       </w:r>
-      <w:hyperlink r:id="rId12">
+      <w:hyperlink r:id="rId14">
         <w:r>
           <w:rPr>
             <w:rFonts w:ascii="Times New Roman" w:hAnsi="Times New Roman"/>

</xml_diff>